<commit_message>
Audit fixes: YouTube titles article
Co-Authored-By: Claude Opus 5.5 <noreply@anthropic.com>
Claude-Session: https://claude.ai/code/session_01GQXcnZLn4f9MkUS7SEqp5J
</commit_message>
<xml_diff>
--- a/blog-content/How-to-Write-YouTube-Titles.docx
+++ b/blog-content/How-to-Write-YouTube-Titles.docx
@@ -153,7 +153,7 @@
         </w:rPr>
         <w:t xml:space="preserve">Most title advice is a list of "power words" and formulas with no evidence behind it. This guide uses three things instead: what YouTube's own help pages say, the 60 titles currently ranking for six everyday business searches, and YouTube's rules on testing and clickbait. It's about titles for YouTube videos and Shorts, and it's part of our </w:t>
       </w:r>
-      <w:hyperlink w:history="1" r:id="rIdyg4efjrbf5faky82xhb_o">
+      <w:hyperlink w:history="1" r:id="rId9vvyhacbxw47luuyx38tz">
         <w:r>
           <w:rPr>
             <w:rStyle w:val="Hyperlink"/>
@@ -392,7 +392,7 @@
                 <w:sz w:val="24"/>
                 <w:szCs w:val="24"/>
               </w:rPr>
-              <w:t xml:space="preserve">A reason to stop: a result, a question or a surprise</w:t>
+              <w:t xml:space="preserve">A reason to stop: a result, a question, a surprise or a feeling (relief, worry, excitement)</w:t>
             </w:r>
           </w:p>
         </w:tc>
@@ -1122,7 +1122,7 @@
         </w:rPr>
         <w:t xml:space="preserve">YouTube's help page on descriptions recommends identifying </w:t>
       </w:r>
-      <w:hyperlink w:history="1" r:id="rIdf0yc-pcn2-qceaqjo8bnz">
+      <w:hyperlink w:history="1" r:id="rIdjgaytnxiqnucukj9v5pxv">
         <w:r>
           <w:rPr>
             <w:rStyle w:val="Hyperlink"/>
@@ -1288,7 +1288,29 @@
           <w:sz w:val="24"/>
           <w:szCs w:val="24"/>
         </w:rPr>
-        <w:t xml:space="preserve">Your first title is rarely your best. Write ten, each using a different angle from the formula table below: a how-to, a number, a mistake, a result. Then pick the two or three that make the clearest promise.</w:t>
+        <w:t xml:space="preserve">Your first title is rarely your best. Write ten, each using a different angle from the formula table below: a how-to, a number, a mistake, a result. Then pick the two or three that make the clearest promise. An AI tool can draft extra variations quickly, but edit them into your viewers' words; our guide to </w:t>
+      </w:r>
+      <w:hyperlink w:history="1" r:id="rIdwyi4v6b9ms91jke_ym2rh">
+        <w:r>
+          <w:rPr>
+            <w:rStyle w:val="Hyperlink"/>
+            <w:rFonts w:ascii="Calibri" w:cs="Calibri" w:eastAsia="Calibri" w:hAnsi="Calibri"/>
+            <w:color w:val="0563C1"/>
+            <w:sz w:val="24"/>
+            <w:szCs w:val="24"/>
+            <w:u w:val="single"/>
+          </w:rPr>
+          <w:t xml:space="preserve">making AI writing sound human</w:t>
+        </w:r>
+      </w:hyperlink>
+      <w:r>
+        <w:rPr>
+          <w:rFonts w:ascii="Calibri" w:cs="Calibri" w:eastAsia="Calibri" w:hAnsi="Calibri"/>
+          <w:color w:val="333333"/>
+          <w:sz w:val="24"/>
+          <w:szCs w:val="24"/>
+        </w:rPr>
+        <w:t xml:space="preserve"> shows what to change.</w:t>
       </w:r>
     </w:p>
     <w:p>
@@ -1319,7 +1341,7 @@
           <w:sz w:val="24"/>
           <w:szCs w:val="24"/>
         </w:rPr>
-        <w:t xml:space="preserve">Move the main keyword into the first 40 characters, cut words that add nothing ("video", "amazing", "very"), and read the title on a phone. Titles are cut off sooner on small screens, and the cut point varies with the device and where the video appears. If the visible part still makes sense, the title works.</w:t>
+        <w:t xml:space="preserve">Move the main keyword into the first 40 characters, cut words that add nothing ("video", "amazing", "very"), use the keyword once rather than repeating it, and read the title on a phone. Titles are cut off sooner on small screens, and the cut point varies with the device and where the video appears. If the visible part still makes sense, the title works.</w:t>
       </w:r>
     </w:p>
     <w:p>
@@ -2069,7 +2091,7 @@
         </w:rPr>
         <w:t xml:space="preserve">Use a number only if it's true, and use "I tried" only if you did. For more general headline patterns, our guide to </w:t>
       </w:r>
-      <w:hyperlink w:history="1" r:id="rIdvc6yxrwoy2gliuynhhkzw">
+      <w:hyperlink w:history="1" r:id="rIdatch7vprw2yucc5426sub">
         <w:r>
           <w:rPr>
             <w:rStyle w:val="Hyperlink"/>
@@ -2122,7 +2144,7 @@
         </w:rPr>
         <w:t xml:space="preserve">A YouTube title can be up to 100 characters, as </w:t>
       </w:r>
-      <w:hyperlink w:history="1" r:id="rIdhvfgvceaeqpec5ueugmbl">
+      <w:hyperlink w:history="1" r:id="rIdalrkuk19zdpi0szmjx-xf">
         <w:r>
           <w:rPr>
             <w:rStyle w:val="Hyperlink"/>
@@ -2158,7 +2180,7 @@
         </w:rPr>
         <w:t xml:space="preserve">Longer titles do rank: 18 of our 60 were over 70 characters. They work when the extra words are the second part in brackets ("(Achievable, No Equipment)"), so nothing essential is lost if the end is cut. YouTube doesn't publish where titles are truncated, and it varies by screen. For limits on other platforms, see our </w:t>
       </w:r>
-      <w:hyperlink w:history="1" r:id="rIdk1utfapclq3xj7lbtodts">
+      <w:hyperlink w:history="1" r:id="rIdrd51gqahteddy89qdhm61">
         <w:r>
           <w:rPr>
             <w:rStyle w:val="Hyperlink"/>
@@ -2254,7 +2276,7 @@
         </w:rPr>
         <w:t xml:space="preserve"> in YouTube Studio, according to </w:t>
       </w:r>
-      <w:hyperlink w:history="1" r:id="rIdxfnuloclucfzu0gqxhae0">
+      <w:hyperlink w:history="1" r:id="rIddapiylm44e_-u_wqo7wgh">
         <w:r>
           <w:rPr>
             <w:rStyle w:val="Hyperlink"/>
@@ -2427,7 +2449,7 @@
         </w:rPr>
         <w:t xml:space="preserve">YouTube's </w:t>
       </w:r>
-      <w:hyperlink w:history="1" r:id="rIddm6ks3o9fsbbczjyuk-lz">
+      <w:hyperlink w:history="1" r:id="rId1v6hfpfxj9kftlfbclqvt">
         <w:r>
           <w:rPr>
             <w:rStyle w:val="Hyperlink"/>
@@ -2467,7 +2489,7 @@
         </w:rPr>
         <w:t xml:space="preserve">In December 2024 YouTube said it would </w:t>
       </w:r>
-      <w:hyperlink w:history="1" r:id="rIdt3dcnkylz-tz4gy8ue66c">
+      <w:hyperlink w:history="1" r:id="rIdeaq6g_3mt-gcfxtyhbov9">
         <w:r>
           <w:rPr>
             <w:rStyle w:val="Hyperlink"/>
@@ -2501,7 +2523,7 @@
           <w:sz w:val="24"/>
           <w:szCs w:val="24"/>
         </w:rPr>
-        <w:t xml:space="preserve">Clickbait also fails on its own terms. When viewers click and leave, the video loses watch time, and YouTube's title test picks winners by watch time, not clicks.</w:t>
+        <w:t xml:space="preserve">Clickbait also fails on its own terms: viewers who click and leave early cut your watch time, which is the number YouTube's own title test uses to pick a winner.</w:t>
       </w:r>
     </w:p>
     <w:p>
@@ -2585,7 +2607,7 @@
         </w:rPr>
         <w:t xml:space="preserve"> and can't include invalid characters (</w:t>
       </w:r>
-      <w:hyperlink w:history="1" r:id="rIdmsz-xg-lquwdh2-jyeq54">
+      <w:hyperlink w:history="1" r:id="rId702thdzgmt9kucowdv6aq">
         <w:r>
           <w:rPr>
             <w:rStyle w:val="Hyperlink"/>
@@ -2644,7 +2666,7 @@
         </w:rPr>
         <w:t xml:space="preserve"> that describe the video in both the title and description, found with the Research tab or Google Ads Keyword Planner (</w:t>
       </w:r>
-      <w:hyperlink w:history="1" r:id="rIduu7orn84uqryg1jvydngt">
+      <w:hyperlink w:history="1" r:id="rId57bunikt9rvtpp8cfkjlj">
         <w:r>
           <w:rPr>
             <w:rStyle w:val="Hyperlink"/>
@@ -2738,7 +2760,7 @@
           <w:sz w:val="24"/>
           <w:szCs w:val="24"/>
         </w:rPr>
-        <w:t xml:space="preserve"> with Test &amp; Compare; the winner is the one with the most watch time.</w:t>
+        <w:t xml:space="preserve"> with Test &amp; Compare (details below).</w:t>
       </w:r>
     </w:p>
     <w:p>
@@ -2777,7 +2799,7 @@
         </w:rPr>
         <w:t xml:space="preserve"> for viewers in other languages; translated titles and descriptions </w:t>
       </w:r>
-      <w:hyperlink w:history="1" r:id="rIdbl3tgnfwcnrw16zktnuje">
+      <w:hyperlink w:history="1" r:id="rId-5qsktpxmdzsc-dwrits7">
         <w:r>
           <w:rPr>
             <w:rStyle w:val="Hyperlink"/>
@@ -2844,7 +2866,7 @@
         </w:rPr>
         <w:t xml:space="preserve">Use Test &amp; Compare in YouTube Studio to test up to three titles, or title and thumbnail combinations, on one video. YouTube picks the winner by watch time, not click-through rate, and shows the winning version to everyone when the test ends. Title testing reached all eligible creators in December 2025, as </w:t>
       </w:r>
-      <w:hyperlink w:history="1" r:id="rIdwmuzw-pvor5sqrzk1s52i">
+      <w:hyperlink w:history="1" r:id="rId0_vjbv5bfdvnz24isdsdk">
         <w:r>
           <w:rPr>
             <w:rStyle w:val="Hyperlink"/>
@@ -2880,7 +2902,7 @@
         </w:rPr>
         <w:t xml:space="preserve">The rules, from </w:t>
       </w:r>
-      <w:hyperlink w:history="1" r:id="rId5fkthprhepdll1889k1-u">
+      <w:hyperlink w:history="1" r:id="rIduldip_t4nbo3djs3sdflm">
         <w:r>
           <w:rPr>
             <w:rStyle w:val="Hyperlink"/>
@@ -3272,7 +3294,7 @@
         </w:rPr>
         <w:t xml:space="preserve">Usually not. YouTube lets you add hashtags to titles, but </w:t>
       </w:r>
-      <w:hyperlink w:history="1" r:id="rIdmlmg_cnpu3nzj0c1kanvo">
+      <w:hyperlink w:history="1" r:id="rIdfn_f1xxrymj1jcpzvpdxx">
         <w:r>
           <w:rPr>
             <w:rStyle w:val="Hyperlink"/>
@@ -3449,7 +3471,7 @@
         </w:rPr>
         <w:t xml:space="preserve">Check where your views come from, find the two words viewers search, write ten versions and keep the one with the clearest promise in its first 40 characters. Then run it through our free </w:t>
       </w:r>
-      <w:hyperlink w:history="1" r:id="rIdjg6siizkilwfbtvyqhpyj">
+      <w:hyperlink w:history="1" r:id="rIdvm0ja2ljp-rtwafuvjmrb">
         <w:r>
           <w:rPr>
             <w:rStyle w:val="Hyperlink"/>

</xml_diff>